<commit_message>
Publish current program figures on the six canonical resumes.
Letters are 19, papers 9, and USPTO filings are 36 applications across 26 families. The AI resume carries the fleet strip from this week's submitted AI resumes, restamped to floors measured 2026-09-21: over 48,000 commits, a commit gate of over 100 checks, and over 24,000 advisory firings across 32 classes.

Out of scope: the homepage matrix alpha fix is the parent commit, still unpushed.

Co-authored-by: Cursor <cursoragent@cursor.com>
</commit_message>
<xml_diff>
--- a/resumes/Zukowski_Resume_AI_Governance_Infrastructure.docx
+++ b/resumes/Zukowski_Resume_AI_Governance_Infrastructure.docx
@@ -129,11 +129,13 @@
           <w:i w:val="0"/>
           <w:sz w:val="17"/>
         </w:rPr>
-        <w:t>· Digital assets since 2016 (10 years) · 22 MCP + API connections · Diligence⁠-⁠doc review 4hr to 1hr</w:t>
+        <w:t>· Agent fleet: over 48,000 commits · sixteen to forty-three concurrent sessions · commit gate of over 100 checks</w:t>
         <w:br/>
-        <w:t>· 8 SSRN papers · 18 federal comment letters · FSB AI consultation response</w:t>
+        <w:t>· over 24,000 advisory firings measured across 32 classes · 75⁠-⁠skill library · 33⁠-⁠file canonical⁠-⁠state layer</w:t>
         <w:br/>
-        <w:t>· 30 USPTO patent applications across 20 families (Canonical⁠-⁠State Architecture for multi⁠-⁠agent AI research)</w:t>
+        <w:t>· 36 USPTO patent applications across 26 families (Canonical⁠-⁠State Architecture for multi⁠-⁠agent AI research)</w:t>
+        <w:br/>
+        <w:t>· 9 SSRN papers · 19 federal comment letters · FSB AI consultation response</w:t>
       </w:r>
     </w:p>
     <w:p>
@@ -235,7 +237,7 @@
         <w:ind w:left="320" w:hanging="160"/>
       </w:pPr>
       <w:r>
-        <w:t xml:space="preserve">• Authored an eight-paper SSRN-live research program covering the </w:t>
+        <w:t xml:space="preserve">• Authored a nine-paper SSRN-live research program covering the </w:t>
       </w:r>
       <w:hyperlink r:id="rId7">
         <w:r>
@@ -299,7 +301,7 @@
         <w:ind w:left="320" w:hanging="160"/>
       </w:pPr>
       <w:r>
-        <w:t xml:space="preserve">• Contributed eighteen comment letters across a federal regulatory program (OCC bank stablecoin engagement </w:t>
+        <w:t xml:space="preserve">• Contributed nineteen comment letters across a federal regulatory program (OCC bank stablecoin engagement </w:t>
       </w:r>
       <w:hyperlink r:id="rId13">
         <w:r>
@@ -686,7 +688,7 @@
         <w:t>Canonical-State Architecture.</w:t>
       </w:r>
       <w:r>
-        <w:t>Filed thirty US patent applications across twenty families in 2026. Twelve applications across four families cover coordination and integrity for concurrent AI-agent sessions on a shared version-controlled repository: per-session staging-index isolation, a multi-mode verification engine, a commit-time canonical-state coherence gate, recursive self-validation of discipline codifications, a tamper-evident coordination-proof log, authorship-narrowed commit replay with a per-writer edit-intent ledger, and statement-time provenance binding under fail-closed admission control; validated on over 27,000 commits and sixteen to forty-three concurrent agents over five months (as of 2026-08-26), with a companion 73-page methodology preprint. The other sixteen families cover evidence-grounding interlocks that keep a machine-generated assessment from resting on unverifiable or hallucinated evidence (two applications); typed-absence control attribution for pseudonymous on-chain systems (three); instrument-absence emitted as a typed outcome, held distinct from the affirmative verdict it resembles, including verifier-integrity controls (two); authority-aware context retrieval, resource-triggered session handoff, fleet launch-governance admission, transcript-derived contribution attestation, and derived-artifact coherence (six); calibration-gated detector promotion and validity-preserving evaluation instrumentation (three); and self-calibrating thresholds for reputation-weighted on-chain governance (two).</w:t>
+        <w:t xml:space="preserve"> Filed thirty-six US patent applications across twenty-six families in 2026: a five-element coordination system for concurrent AI-agent sessions on a shared version-controlled repository, integrating per-session staging-index isolation, a multi-mode verification engine, a commit-time canonical-state coherence gate, recursive self-validation of discipline codifications, and an operator-confirmed promotion gate; validated on over 48,000 commits (measured 2026-09-21), a commit gate of over 100 checks, and over 24,000 advisory firings across 32 classes, with sixteen to forty-three concurrent AI coding sessions (census 2026-08-26) and a companion 73-page methodology preprint. The applications extend the architecture to role-routed cross-session coordination, actual-touched-file collision detection, and a self-describing verification registry, plus separate applications for evidence-grounding of AI-generated assessments and cited values.</w:t>
       </w:r>
     </w:p>
     <w:p>

</xml_diff>

<commit_message>
Use the measured session overlap on the AI resume.
The proof strip still said sixteen to forty-three because a non-breaking space hid that phrase from the previous replacement. The rendered resume now says a typical overlap of 12 and a peak of 48, matching the concurrency producer.

Out of scope: the three unpushed parents that carry the homepage fix, the resume counts, and the scale restamp.

Co-authored-by: Cursor <cursoragent@cursor.com>
</commit_message>
<xml_diff>
--- a/resumes/Zukowski_Resume_AI_Governance_Infrastructure.docx
+++ b/resumes/Zukowski_Resume_AI_Governance_Infrastructure.docx
@@ -129,7 +129,7 @@
           <w:i w:val="0"/>
           <w:sz w:val="17"/>
         </w:rPr>
-        <w:t>· Agent fleet: over 48,000 commits · sixteen to forty-three concurrent sessions · commit gate of over 100 checks</w:t>
+        <w:t>· Agent fleet: over 48,000 commits · typical overlap 12, peak 48 · commit gate of over 100 checks</w:t>
         <w:br/>
         <w:t>· over 24,000 advisory firings measured across 32 classes · 75⁠-⁠skill library · 33⁠-⁠file canonical⁠-⁠state layer</w:t>
         <w:br/>
@@ -688,7 +688,7 @@
         <w:t>Canonical-State Architecture.</w:t>
       </w:r>
       <w:r>
-        <w:t xml:space="preserve"> Filed thirty-six US patent applications across twenty-six families in 2026: a five-element coordination system for concurrent AI-agent sessions on a shared version-controlled repository, integrating per-session staging-index isolation, a multi-mode verification engine, a commit-time canonical-state coherence gate, recursive self-validation of discipline codifications, and an operator-confirmed promotion gate; validated on over 48,000 commits (measured 2026-09-21), a commit gate of over 100 checks, and over 24,000 advisory firings across 32 classes, with a typical overlap of 12 concurrent sessions and a peak of 48 and a companion 73-page methodology preprint. The applications extend the architecture to role-routed cross-session coordination, actual-touched-file collision detection, and a self-describing verification registry, plus separate applications for evidence-grounding of AI-generated assessments and cited values.</w:t>
+        <w:t xml:space="preserve"> Filed thirty-six US patent applications across twenty-six families in 2026: a five-element coordination system for concurrent AI-agent sessions on a shared version-controlled repository, integrating per-session staging-index isolation, a multi-mode verification engine, a commit-time canonical-state coherence gate, recursive self-validation of discipline codifications, and an operator-confirmed promotion gate; validated on over 48,000 commits (measured 2026-09-21), a commit gate of over 100 checks, and over 24,000 advisory firings across 32 classes, with a typical overlap of 12 concurrent sessions and a peak of 48, plus a companion 73-page methodology preprint. The applications extend the architecture to role-routed cross-session coordination, actual-touched-file collision detection, and a self-describing verification registry, plus separate applications for evidence-grounding of AI-generated assessments and cited values.</w:t>
       </w:r>
     </w:p>
     <w:p>

</xml_diff>

<commit_message>
Record filed application 64/159,546 on the site and the six resumes.
The public count moves from 36 applications to 37. The family count stays 26 because this provisional is in the same family as 64/107,069.

Cursor + Grok 4.7 extra high
</commit_message>
<xml_diff>
--- a/resumes/Zukowski_Resume_AI_Governance_Infrastructure.docx
+++ b/resumes/Zukowski_Resume_AI_Governance_Infrastructure.docx
@@ -133,7 +133,7 @@
         <w:br/>
         <w:t>· over 24,000 advisory firings measured across 32 classes · 75⁠-⁠skill library · 33⁠-⁠file canonical⁠-⁠state layer</w:t>
         <w:br/>
-        <w:t>· 36 USPTO patent applications across 26 families (Canonical⁠-⁠State Architecture for multi⁠-⁠agent AI research)</w:t>
+        <w:t>· 37 USPTO patent applications across 26 families (Canonical⁠-⁠State Architecture for multi⁠-⁠agent AI research)</w:t>
         <w:br/>
         <w:t>· 9 SSRN papers · 19 federal comment letters · FSB AI consultation response</w:t>
       </w:r>
@@ -688,7 +688,7 @@
         <w:t>Canonical-State Architecture.</w:t>
       </w:r>
       <w:r>
-        <w:t xml:space="preserve"> Filed thirty-six US patent applications across twenty-six families in 2026: a five-element coordination system for concurrent AI-agent sessions on a shared version-controlled repository, integrating per-session staging-index isolation, a multi-mode verification engine, a commit-time canonical-state coherence gate, recursive self-validation of discipline codifications, and an operator-confirmed promotion gate; validated on over 48,000 commits (measured 2026-09-21), a commit gate of over 100 checks, and over 24,000 advisory firings across 32 classes, with a typical overlap of 12 concurrent sessions and a peak of 48, plus a companion 73-page methodology preprint. The applications extend the architecture to role-routed cross-session coordination, actual-touched-file collision detection, and a self-describing verification registry, plus separate applications for evidence-grounding of AI-generated assessments and cited values.</w:t>
+        <w:t xml:space="preserve"> Filed thirty-seven US patent applications across twenty-six families in 2026: a five-element coordination system for concurrent AI-agent sessions on a shared version-controlled repository, integrating per-session staging-index isolation, a multi-mode verification engine, a commit-time canonical-state coherence gate, recursive self-validation of discipline codifications, and an operator-confirmed promotion gate; validated on over 48,000 commits (measured 2026-09-21), a commit gate of over 100 checks, and over 24,000 advisory firings across 32 classes, with a typical overlap of 12 concurrent sessions and a peak of 48, plus a companion 73-page methodology preprint. The applications extend the architecture to role-routed cross-session coordination, actual-touched-file collision detection, and a self-describing verification registry, plus separate applications for evidence-grounding of AI-generated assessments and cited values.</w:t>
       </w:r>
     </w:p>
     <w:p>

</xml_diff>

<commit_message>
Rebuild the AI governance and policy resumes from the current resume spec.
Their wording had moved past the last publish, so a figure refresh alone could not
bring them back in line with the spec. The AI resume now opens with the fleet figures
header plus the patents line; the policy resume states 19 comment letters as a numeral,
spells out the MVEP-AI name, and counts 27 patent families and a 77-skill library.
Both are two pages.

Tokenization Systems - Opus 5.5 <zach@tokenization.systems>
</commit_message>
<xml_diff>
--- a/resumes/Zukowski_Resume_AI_Governance_Infrastructure.docx
+++ b/resumes/Zukowski_Resume_AI_Governance_Infrastructure.docx
@@ -129,11 +129,11 @@
           <w:i w:val="0"/>
           <w:sz w:val="17"/>
         </w:rPr>
-        <w:t>· Agent fleet: over 48,000 commits · typical overlap 12, peak 48 · commit gate of over 100 checks</w:t>
+        <w:t>· Agent fleet: over 52,000 commits · typical overlap 14, peak 61 · commit gate of over 100 checks</w:t>
         <w:br/>
-        <w:t>· over 24,000 advisory firings measured across 32 classes · 75⁠-⁠skill library · 33⁠-⁠file canonical⁠-⁠state layer</w:t>
+        <w:t>· over 19,000 advisory firings measured across 28 classes · 77⁠-⁠skill library · 33⁠-⁠file canonical⁠-⁠state layer</w:t>
         <w:br/>
-        <w:t>· 37 USPTO patent applications across 26 families (Canonical⁠-⁠State Architecture for multi⁠-⁠agent AI research)</w:t>
+        <w:t>· 37 USPTO patent applications across 27 families (Canonical⁠-⁠State Architecture for multi⁠-⁠agent AI research)</w:t>
         <w:br/>
         <w:t>· 9 SSRN papers · 19 federal comment letters · FSB AI consultation response</w:t>
       </w:r>
@@ -301,7 +301,7 @@
         <w:ind w:left="320" w:hanging="160"/>
       </w:pPr>
       <w:r>
-        <w:t xml:space="preserve">• Contributed nineteen comment letters across a federal regulatory program (OCC bank stablecoin engagement </w:t>
+        <w:t xml:space="preserve">• Contributed 19 comment letters across a federal regulatory program (OCC bank stablecoin engagement </w:t>
       </w:r>
       <w:hyperlink r:id="rId13">
         <w:r>
@@ -400,7 +400,7 @@
         </w:r>
       </w:hyperlink>
       <w:r>
-        <w:t xml:space="preserve"> (Jul 2026), the first external deployment of the MVEP-AI / CLII-AI operator-accountability stack; </w:t>
+        <w:t xml:space="preserve"> (Jul 2026), the first external deployment of the AI-domain extensions of the Minimum Viable Equivalence Pack and Control Layer Intensity Index (MVEP-AI / CLII-AI); </w:t>
       </w:r>
       <w:hyperlink r:id="rId22">
         <w:r>
@@ -688,7 +688,7 @@
         <w:t>Canonical-State Architecture.</w:t>
       </w:r>
       <w:r>
-        <w:t xml:space="preserve"> Filed thirty-seven US patent applications across twenty-six families in 2026: a five-element coordination system for concurrent AI-agent sessions on a shared version-controlled repository, integrating per-session staging-index isolation, a multi-mode verification engine, a commit-time canonical-state coherence gate, recursive self-validation of discipline codifications, and an operator-confirmed promotion gate; validated on over 48,000 commits (measured 2026-09-21), a commit gate of over 100 checks, and over 24,000 advisory firings across 32 classes, with a typical overlap of 12 concurrent sessions and a peak of 48, plus a companion 73-page methodology preprint. The applications extend the architecture to role-routed cross-session coordination, actual-touched-file collision detection, and a self-describing verification registry, plus separate applications for evidence-grounding of AI-generated assessments and cited values.</w:t>
+        <w:t>Filed 37 US patent applications across 27 families in 2026. Thirteen applications across four families cover coordination and integrity for concurrent AI-agent sessions on a shared version-controlled repository: per-session staging-index isolation, a multi-mode verification engine, a commit-time canonical-state coherence gate, recursive self-validation of discipline codifications, a tamper-evident coordination-proof log, authorship-narrowed commit replay with a per-writer edit-intent ledger, and statement-time provenance binding under fail-closed admission control; validated on over 52,000 commits and 12 to 55 concurrent agents over six months (as of 2026-09-28), with a companion 73-page methodology preprint. The other twenty-two families cover evidence-grounding interlocks against hallucinated machine assessment (two applications); typed-absence control attribution for pseudonymous on-chain systems (three); instrument-absence as a typed outcome with verifier-integrity controls (two); authority-aware context retrieval, resource-triggered session handoff, fleet launch-governance admission, contribution attestation, and derived-artifact coherence (six); calibration-gated detector promotion and evaluation instrumentation (three); reputation-weighted governance thresholds (two); and six families filed since August covering provenance-chain attribution, source-fidelity omission-and-fabrication detection, outbound-artifact gating as typed negative outcomes, blinded evaluation batteries, peer-health-gated destructive cleanup, and confidence-gated typed-judgment offload (one each).</w:t>
       </w:r>
     </w:p>
     <w:p>
@@ -938,7 +938,7 @@
         <w:t>Stack:</w:t>
       </w:r>
       <w:r>
-        <w:t xml:space="preserve"> Python (pandas, statsmodels, scipy, matplotlib), R (fixest, did, synthdid), SQL (DuneSQL, Trino), JavaScript / TypeScript; 22 MCP and API connections wrapping the data sources above plus GitHub; Claude.ai + Claude Code + Cursor with 74-skill library and 33-file canonical-state architecture; n8n, Apify, Git / GitHub</w:t>
+        <w:t xml:space="preserve"> Python (pandas, statsmodels, scipy, matplotlib), R (fixest, did, synthdid), SQL (DuneSQL, Trino), JavaScript / TypeScript; 22 MCP and API connections wrapping the data sources above plus GitHub; Claude.ai + Claude Code + Cursor with 77-skill library and 33-file canonical-state architecture; n8n, Apify, Git / GitHub</w:t>
       </w:r>
     </w:p>
     <w:p>

</xml_diff>

<commit_message>
resumes(site): carry 2 moved measured figure(s) into the shipped copies (unattended refresh, not pushed)
Written by scripts/cz_site_resume_refresh_tick.sh on pop-os at 2026-09-28T23:12:12Z, from the workflow clone at origin/main b125110d62.
Every figure is measure_scale_figures.measured_substitutions(), the same object resume_spec.py imports.

Runs changed (old -> new):
  '52,000' -> '53,000'
  '52,000' -> '53,000'

Oracle: PASS: pipeline reproduces shipped

NOT PUSHED: a site push deploys the live site and is the author's outward act. Review with
  git -C /home/zach/ai-research/CryptoZach log origin/main..HEAD -- resumes/

Refresh-producer: resumes/_render/refresh_shipped_measured_figures.py
Refresh-tick: scripts/cz_site_resume_refresh_tick.sh
Measured-from: b125110d62

Tokenization Systems <zach@tokenization.systems>
</commit_message>
<xml_diff>
--- a/resumes/Zukowski_Resume_AI_Governance_Infrastructure.docx
+++ b/resumes/Zukowski_Resume_AI_Governance_Infrastructure.docx
@@ -129,7 +129,7 @@
           <w:i w:val="0"/>
           <w:sz w:val="17"/>
         </w:rPr>
-        <w:t>· Agent fleet: over 52,000 commits · typical overlap 14, peak 61 · commit gate of over 100 checks</w:t>
+        <w:t>· Agent fleet: over 53,000 commits · typical overlap 14, peak 61 · commit gate of over 100 checks</w:t>
         <w:br/>
         <w:t>· over 20,000 advisory firings measured across 28 classes · 77⁠-⁠skill library · 33⁠-⁠file canonical⁠-⁠state layer</w:t>
         <w:br/>
@@ -688,7 +688,7 @@
         <w:t>Canonical-State Architecture.</w:t>
       </w:r>
       <w:r>
-        <w:t>Filed 37 US patent applications across 27 families in 2026. Thirteen applications across four families cover coordination and integrity for concurrent AI-agent sessions on a shared version-controlled repository: per-session staging-index isolation, a multi-mode verification engine, a commit-time canonical-state coherence gate, recursive self-validation of discipline codifications, a tamper-evident coordination-proof log, authorship-narrowed commit replay with a per-writer edit-intent ledger, and statement-time provenance binding under fail-closed admission control; validated on over 52,000 commits and 12 to 55 concurrent agents over six months (as of 2026-09-28), with a companion 73-page methodology preprint. The other twenty-two families cover evidence-grounding interlocks against hallucinated machine assessment (two applications); typed-absence control attribution for pseudonymous on-chain systems (three); instrument-absence as a typed outcome with verifier-integrity controls (two); authority-aware context retrieval, resource-triggered session handoff, fleet launch-governance admission, contribution attestation, and derived-artifact coherence (six); calibration-gated detector promotion and evaluation instrumentation (three); reputation-weighted governance thresholds (two); and six families filed since August covering provenance-chain attribution, source-fidelity omission-and-fabrication detection, outbound-artifact gating as typed negative outcomes, blinded evaluation batteries, peer-health-gated destructive cleanup, and confidence-gated typed-judgment offload (one each).</w:t>
+        <w:t>Filed 37 US patent applications across 27 families in 2026. Thirteen applications across four families cover coordination and integrity for concurrent AI-agent sessions on a shared version-controlled repository: per-session staging-index isolation, a multi-mode verification engine, a commit-time canonical-state coherence gate, recursive self-validation of discipline codifications, a tamper-evident coordination-proof log, authorship-narrowed commit replay with a per-writer edit-intent ledger, and statement-time provenance binding under fail-closed admission control; validated on over 53,000 commits and 12 to 55 concurrent agents over six months (as of 2026-09-28), with a companion 73-page methodology preprint. The other twenty-two families cover evidence-grounding interlocks against hallucinated machine assessment (two applications); typed-absence control attribution for pseudonymous on-chain systems (three); instrument-absence as a typed outcome with verifier-integrity controls (two); authority-aware context retrieval, resource-triggered session handoff, fleet launch-governance admission, contribution attestation, and derived-artifact coherence (six); calibration-gated detector promotion and evaluation instrumentation (three); reputation-weighted governance thresholds (two); and six families filed since August covering provenance-chain attribution, source-fidelity omission-and-fabrication detection, outbound-artifact gating as typed negative outcomes, blinded evaluation batteries, peer-health-gated destructive cleanup, and confidence-gated typed-judgment offload (one each).</w:t>
       </w:r>
     </w:p>
     <w:p>

</xml_diff>

<commit_message>
resumes(site): carry 7 moved measured figure(s) into the shipped copies (unattended refresh)
Runs changed (old -> new):
  '77\u2060-\u2060skill' -> '78\u2060-\u2060skill'
  '77-skill' -> '78-skill'
  '77-skill' -> '78-skill'
  '77-skill' -> '78-skill'
  '77-skill' -> '78-skill'
  '77-skill' -> '78-skill'
  '77-skill' -> '78-skill'

Oracle: PASS: pipeline reproduces shipped

Tokenization Systems <zach@tokenization.systems>
</commit_message>
<xml_diff>
--- a/resumes/Zukowski_Resume_AI_Governance_Infrastructure.docx
+++ b/resumes/Zukowski_Resume_AI_Governance_Infrastructure.docx
@@ -131,7 +131,7 @@
         </w:rPr>
         <w:t>· Agent fleet: over 55,000 commits · typical overlap 14, peak 61 · commit gate of over 100 checks</w:t>
         <w:br/>
-        <w:t>· over 22,000 advisory firings measured across 28 classes · 77⁠-⁠skill library · 33⁠-⁠file canonical⁠-⁠state layer</w:t>
+        <w:t>· over 22,000 advisory firings measured across 28 classes · 78⁠-⁠skill library · 33⁠-⁠file canonical⁠-⁠state layer</w:t>
         <w:br/>
         <w:t>· 37 USPTO patent applications across 27 families (Canonical⁠-⁠State Architecture for multi⁠-⁠agent AI research)</w:t>
         <w:br/>
@@ -938,7 +938,7 @@
         <w:t>Stack:</w:t>
       </w:r>
       <w:r>
-        <w:t xml:space="preserve"> Python (pandas, statsmodels, scipy, matplotlib), R (fixest, did, synthdid), SQL (DuneSQL, Trino), JavaScript / TypeScript; 22 MCP and API connections wrapping the data sources above plus GitHub; Claude.ai + Claude Code + Cursor with 77-skill library and 33-file canonical-state architecture; n8n, Apify, Git / GitHub</w:t>
+        <w:t xml:space="preserve"> Python (pandas, statsmodels, scipy, matplotlib), R (fixest, did, synthdid), SQL (DuneSQL, Trino), JavaScript / TypeScript; 22 MCP and API connections wrapping the data sources above plus GitHub; Claude.ai + Claude Code + Cursor with 78-skill library and 33-file canonical-state architecture; n8n, Apify, Git / GitHub</w:t>
       </w:r>
     </w:p>
     <w:p>

</xml_diff>

<commit_message>
resumes: re-render the six resumes from the updated source
- All six: the technical tools line adds OpenAI Codex, Jev (TypeSafe) typed-judgment offload, local models via Ollama (IBM Granite, Qwen) and BigQuery.
- AI Governance and Infrastructure: the founder bullets open with the human-in-the-loop layer; the patent entry's breakdown now sums to its headline (37 applications, 27 families); a missing space after "Canonical-State Architecture." is restored.
- AI Governance and Infrastructure, Asset Management, Operator and Product: the LayerZero sourcing bullet no longer says "for Borderless".

Reviewed and approved by the author before publishing.

Tokenization Systems - Claude Opus 5.5 <zach@tokenization.systems>
</commit_message>
<xml_diff>
--- a/resumes/Zukowski_Resume_AI_Governance_Infrastructure.docx
+++ b/resumes/Zukowski_Resume_AI_Governance_Infrastructure.docx
@@ -13,8 +13,8 @@
           <w:b/>
           <w:bCs/>
           <w:color w:val="1A1A1A"/>
-          <w:sz w:val="38"/>
-          <w:szCs w:val="38"/>
+          <w:sz w:val="37"/>
+          <w:szCs w:val="37"/>
         </w:rPr>
         <w:t xml:space="preserve">Zach Zukowski</w:t>
       </w:r>
@@ -28,8 +28,8 @@
         <w:rPr>
           <w:rFonts w:ascii="Arial" w:cs="Arial" w:eastAsia="Arial" w:hAnsi="Arial"/>
           <w:color w:val="444444"/>
-          <w:sz w:val="18"/>
-          <w:szCs w:val="18"/>
+          <w:sz w:val="17"/>
+          <w:szCs w:val="17"/>
         </w:rPr>
         <w:t xml:space="preserve">Orlando, FL | Zach@Tokenization.Systems | 407-536-8625</w:t>
       </w:r>
@@ -43,16 +43,16 @@
         <w:r>
           <w:rPr>
             <w:rStyle w:val="Hyperlink"/>
-            <w:sz w:val="18"/>
-            <w:szCs w:val="18"/>
+            <w:sz w:val="17"/>
+            <w:szCs w:val="17"/>
           </w:rPr>
           <w:t xml:space="preserve">Tokenization.Systems</w:t>
         </w:r>
       </w:hyperlink>
       <w:r>
         <w:rPr>
-          <w:sz w:val="18"/>
-          <w:szCs w:val="18"/>
+          <w:sz w:val="17"/>
+          <w:szCs w:val="17"/>
         </w:rPr>
         <w:t xml:space="preserve">  |  </w:t>
       </w:r>
@@ -60,16 +60,16 @@
         <w:r>
           <w:rPr>
             <w:rStyle w:val="Hyperlink"/>
-            <w:sz w:val="18"/>
-            <w:szCs w:val="18"/>
+            <w:sz w:val="17"/>
+            <w:szCs w:val="17"/>
           </w:rPr>
           <w:t xml:space="preserve">LinkedIn</w:t>
         </w:r>
       </w:hyperlink>
       <w:r>
         <w:rPr>
-          <w:sz w:val="18"/>
-          <w:szCs w:val="18"/>
+          <w:sz w:val="17"/>
+          <w:szCs w:val="17"/>
         </w:rPr>
         <w:t xml:space="preserve">  |  </w:t>
       </w:r>
@@ -77,16 +77,16 @@
         <w:r>
           <w:rPr>
             <w:rStyle w:val="Hyperlink"/>
-            <w:sz w:val="18"/>
-            <w:szCs w:val="18"/>
+            <w:sz w:val="17"/>
+            <w:szCs w:val="17"/>
           </w:rPr>
           <w:t xml:space="preserve">SSRN</w:t>
         </w:r>
       </w:hyperlink>
       <w:r>
         <w:rPr>
-          <w:sz w:val="18"/>
-          <w:szCs w:val="18"/>
+          <w:sz w:val="17"/>
+          <w:szCs w:val="17"/>
         </w:rPr>
         <w:t xml:space="preserve">  |  </w:t>
       </w:r>
@@ -94,8 +94,8 @@
         <w:r>
           <w:rPr>
             <w:rStyle w:val="Hyperlink"/>
-            <w:sz w:val="18"/>
-            <w:szCs w:val="18"/>
+            <w:sz w:val="17"/>
+            <w:szCs w:val="17"/>
           </w:rPr>
           <w:t xml:space="preserve">Agent infrastructure</w:t>
         </w:r>
@@ -112,8 +112,8 @@
           <w:b/>
           <w:bCs/>
           <w:color w:val="1A1A1A"/>
-          <w:sz w:val="22"/>
-          <w:szCs w:val="22"/>
+          <w:sz w:val="21"/>
+          <w:szCs w:val="21"/>
         </w:rPr>
         <w:t>AI GOVERNANCE · CONTROL-LAYER ACCOUNTABILITY · DILIGENCE FRAMEWORKS</w:t>
       </w:r>
@@ -129,9 +129,9 @@
           <w:i w:val="0"/>
           <w:sz w:val="17"/>
         </w:rPr>
-        <w:t>· Agent fleet: over 55,000 commits · typical overlap 14, peak 61 · commit gate of over 100 checks</w:t>
+        <w:t>· Agent fleet: over 59,000 commits · typical overlap 14, peak 61 · commit gate of over 200 checks</w:t>
         <w:br/>
-        <w:t>· over 22,000 advisory firings measured across 28 classes · 78⁠-⁠skill library · 33⁠-⁠file canonical⁠-⁠state layer</w:t>
+        <w:t>· over 28,000 advisory firings measured across 33 classes · 78⁠-⁠skill library · 33⁠-⁠file canonical⁠-⁠state layer</w:t>
         <w:br/>
         <w:t>· 37 USPTO patent applications across 27 families (Canonical⁠-⁠State Architecture for multi⁠-⁠agent AI research)</w:t>
         <w:br/>
@@ -151,8 +151,8 @@
           <w:b/>
           <w:bCs/>
           <w:color w:val="1A1A1A"/>
-          <w:sz w:val="19"/>
-          <w:szCs w:val="19"/>
+          <w:sz w:val="18"/>
+          <w:szCs w:val="18"/>
         </w:rPr>
         <w:t xml:space="preserve">SUMMARY</w:t>
       </w:r>
@@ -165,8 +165,8 @@
         <w:rPr>
           <w:rFonts w:ascii="Arial" w:cs="Arial" w:eastAsia="Arial" w:hAnsi="Arial"/>
           <w:color w:val="1A1A1A"/>
-          <w:sz w:val="18"/>
-          <w:szCs w:val="18"/>
+          <w:sz w:val="17"/>
+          <w:szCs w:val="17"/>
         </w:rPr>
         <w:t>Ten years in digital assets: independent protocol research from Jul 2016, institutional practice from Dec 2019. AI-augmented research and governance-infrastructure builder who turns control-layer and operator-accountability research into machine-readable diligence systems, now extending that accountability lens from stablecoin gateways to AI deployment. Founder of Tokenization Systems; first hire at Borderless Capital, an RIA.</w:t>
       </w:r>
@@ -179,8 +179,8 @@
         <w:rPr>
           <w:rFonts w:ascii="Arial" w:cs="Arial" w:eastAsia="Arial" w:hAnsi="Arial"/>
           <w:color w:val="1A1A1A"/>
-          <w:sz w:val="18"/>
-          <w:szCs w:val="18"/>
+          <w:sz w:val="17"/>
+          <w:szCs w:val="17"/>
         </w:rPr>
         <w:t>Focus: research-infrastructure engineering, control-layer accountability, machine-readable diligence, agentic workflow automation · MCP server design, Monte Carlo, difference-in-differences, coalition-power analysis · Python, R, DuneSQL.</w:t>
       </w:r>
@@ -198,8 +198,8 @@
           <w:b/>
           <w:bCs/>
           <w:color w:val="1A1A1A"/>
-          <w:sz w:val="19"/>
-          <w:szCs w:val="19"/>
+          <w:sz w:val="18"/>
+          <w:szCs w:val="18"/>
         </w:rPr>
         <w:t xml:space="preserve">EXPERIENCE</w:t>
       </w:r>
@@ -237,6 +237,15 @@
         <w:ind w:left="320" w:hanging="160"/>
       </w:pPr>
       <w:r>
+        <w:t>• Built the human-in-the-loop layer over the fleet: a terminal grid of every live agent session with a phone control bar, and a web dashboard with live session control. Agents act inside declared authority boundaries; consent, outward-facing and irreversible actions stay with the human operator.</w:t>
+      </w:r>
+    </w:p>
+    <w:p>
+      <w:pPr>
+        <w:spacing w:after="36"/>
+        <w:ind w:left="320" w:hanging="160"/>
+      </w:pPr>
+      <w:r>
         <w:t xml:space="preserve">• Authored a nine-paper SSRN-live research program covering the </w:t>
       </w:r>
       <w:hyperlink r:id="rId7">
@@ -551,7 +560,7 @@
         <w:t>LayerZero seed round</w:t>
       </w:r>
       <w:r>
-        <w:t xml:space="preserve"> investment for Borderless, returning ~80x; the underlying cross-chain interoperability thesis preceded the firm's Cross-Chain Ecosystem Fund by two years.</w:t>
+        <w:t xml:space="preserve"> investment, returning ~80x; the underlying cross-chain interoperability thesis preceded the firm's Cross-Chain Ecosystem Fund by two years.</w:t>
       </w:r>
     </w:p>
     <w:p>
@@ -667,8 +676,8 @@
           <w:b/>
           <w:bCs/>
           <w:color w:val="1A1A1A"/>
-          <w:sz w:val="19"/>
-          <w:szCs w:val="19"/>
+          <w:sz w:val="18"/>
+          <w:szCs w:val="18"/>
         </w:rPr>
         <w:t xml:space="preserve">SELECTED RESEARCH</w:t>
       </w:r>
@@ -688,7 +697,7 @@
         <w:t>Canonical-State Architecture.</w:t>
       </w:r>
       <w:r>
-        <w:t>Filed 37 US patent applications across 27 families in 2026. Thirteen applications across four families cover coordination and integrity for concurrent AI-agent sessions on a shared version-controlled repository: per-session staging-index isolation, a multi-mode verification engine, a commit-time canonical-state coherence gate, recursive self-validation of discipline codifications, a tamper-evident coordination-proof log, authorship-narrowed commit replay with a per-writer edit-intent ledger, and statement-time provenance binding under fail-closed admission control; validated on over 55,000 commits and 12 to 55 concurrent agents over six months (as of 2026-09-28), with a companion 73-page methodology preprint. The other twenty-two families cover evidence-grounding interlocks against hallucinated machine assessment (two applications); typed-absence control attribution for pseudonymous on-chain systems (three); instrument-absence as a typed outcome with verifier-integrity controls (two); authority-aware context retrieval, resource-triggered session handoff, fleet launch-governance admission, contribution attestation, and derived-artifact coherence (six); calibration-gated detector promotion and evaluation instrumentation (three); reputation-weighted governance thresholds (two); and six families filed since August covering provenance-chain attribution, source-fidelity omission-and-fabrication detection, outbound-artifact gating as typed negative outcomes, blinded evaluation batteries, peer-health-gated destructive cleanup, and confidence-gated typed-judgment offload (one each).</w:t>
+        <w:t xml:space="preserve"> Filed 37 US patent applications across 27 families in 2026. Twelve applications across four families cover coordination and integrity for concurrent AI-agent sessions on a shared version-controlled repository: per-session staging-index isolation, a multi-mode verification engine, a commit-time canonical-state coherence gate, recursive self-validation of discipline codifications, a tamper-evident coordination-proof log, authorship-narrowed commit replay with a per-writer edit-intent ledger, and statement-time provenance binding under fail-closed admission control; validated on over 59,000 commits and 12 to 55 concurrent agents over seven months (as of 2026-09-28), with a companion 73-page methodology preprint. The other twenty-three families cover evidence-grounding interlocks against hallucinated machine assessment (two applications); typed-absence control attribution for pseudonymous on-chain systems (three); instrument-absence as a typed outcome with verifier-integrity controls (two); authority-aware context retrieval, resource-triggered session handoff, fleet launch-governance admission, contribution attestation, and derived-artifact coherence (six); calibration-gated detector promotion and evaluation instrumentation (three); reputation-weighted governance thresholds (two); and seven families filed since August covering provenance-chain attribution, source-fidelity omission-and-fabrication detection, outbound-artifact gating as typed negative outcomes, blinded evaluation batteries, peer-health-gated destructive cleanup, confidence-gated typed-judgment offload, and warranted destructive maintenance anchored to prior repository state (one each).</w:t>
       </w:r>
     </w:p>
     <w:p>
@@ -730,7 +739,7 @@
         </w:r>
       </w:hyperlink>
       <w:r>
-        <w:t xml:space="preserve"> Operational-risk taxonomy (74 risk vectors, 64 testable controls, 31 program objectives) mapped to a 624-scenario battery; Lido V3 staking-vault case study.</w:t>
+        <w:t xml:space="preserve"> Operational-risk taxonomy (74 risk vectors, 64 testable controls, 36 control objectives) mapped to a 624-configuration battery; Lido V3 staking-vault case study.</w:t>
       </w:r>
     </w:p>
     <w:p>
@@ -893,8 +902,8 @@
           <w:b/>
           <w:bCs/>
           <w:color w:val="1A1A1A"/>
-          <w:sz w:val="19"/>
-          <w:szCs w:val="19"/>
+          <w:sz w:val="18"/>
+          <w:szCs w:val="18"/>
         </w:rPr>
         <w:t xml:space="preserve">TECHNICAL</w:t>
       </w:r>
@@ -938,7 +947,7 @@
         <w:t>Stack:</w:t>
       </w:r>
       <w:r>
-        <w:t xml:space="preserve"> Python (pandas, statsmodels, scipy, matplotlib), R (fixest, did, synthdid), SQL (DuneSQL, Trino), JavaScript / TypeScript; 22 MCP and API connections wrapping the data sources above plus GitHub; Claude.ai + Claude Code + Cursor with 78-skill library and 33-file canonical-state architecture; n8n, Apify, Git / GitHub</w:t>
+        <w:t xml:space="preserve"> Python (pandas, statsmodels, scipy, matplotlib), R (fixest, did, synthdid), SQL (DuneSQL, Trino, BigQuery), JavaScript / TypeScript; 22 MCP and API connections wrapping the data sources above plus GitHub; Claude.ai + Claude Code + OpenAI Codex + Cursor with 78-skill library and 33-file canonical-state architecture; Jev (TypeSafe) typed-judgment offload; local models via Ollama (IBM Granite, Qwen); n8n, Apify, Git / GitHub</w:t>
       </w:r>
     </w:p>
     <w:p>
@@ -954,8 +963,8 @@
           <w:b/>
           <w:bCs/>
           <w:color w:val="1A1A1A"/>
-          <w:sz w:val="19"/>
-          <w:szCs w:val="19"/>
+          <w:sz w:val="18"/>
+          <w:szCs w:val="18"/>
         </w:rPr>
         <w:t>RECOGNITION</w:t>
       </w:r>
@@ -1020,8 +1029,8 @@
           <w:b/>
           <w:bCs/>
           <w:color w:val="1A1A1A"/>
-          <w:sz w:val="19"/>
-          <w:szCs w:val="19"/>
+          <w:sz w:val="18"/>
+          <w:szCs w:val="18"/>
         </w:rPr>
         <w:t xml:space="preserve">EDUCATION</w:t>
       </w:r>
@@ -1230,8 +1239,8 @@
       <w:rPr>
         <w:rFonts w:ascii="Arial" w:cs="Arial" w:eastAsia="Arial" w:hAnsi="Arial"/>
         <w:color w:val="1A1A1A"/>
-        <w:sz w:val="18"/>
-        <w:szCs w:val="18"/>
+        <w:sz w:val="17"/>
+        <w:szCs w:val="17"/>
       </w:rPr>
     </w:rPrDefault>
     <w:pPrDefault/>
@@ -1242,8 +1251,8 @@
     <w:next w:val="Normal"/>
     <w:qFormat/>
     <w:rPr>
-      <w:sz w:val="54"/>
-      <w:szCs w:val="54"/>
+      <w:sz w:val="52"/>
+      <w:szCs w:val="52"/>
     </w:rPr>
   </w:style>
   <w:style w:type="paragraph" w:styleId="Heading1">
@@ -1253,8 +1262,8 @@
     <w:qFormat/>
     <w:rPr>
       <w:color w:val="2E74B5"/>
-      <w:sz w:val="31"/>
-      <w:szCs w:val="31"/>
+      <w:sz w:val="29"/>
+      <w:szCs w:val="29"/>
     </w:rPr>
   </w:style>
   <w:style w:type="paragraph" w:styleId="Heading2">
@@ -1264,8 +1273,8 @@
     <w:qFormat/>
     <w:rPr>
       <w:color w:val="2E74B5"/>
-      <w:sz w:val="25"/>
-      <w:szCs w:val="25"/>
+      <w:sz w:val="24"/>
+      <w:szCs w:val="24"/>
     </w:rPr>
   </w:style>
   <w:style w:type="paragraph" w:styleId="Heading3">
@@ -1275,8 +1284,8 @@
     <w:qFormat/>
     <w:rPr>
       <w:color w:val="1F4D78"/>
-      <w:sz w:val="23"/>
-      <w:szCs w:val="23"/>
+      <w:sz w:val="22"/>
+      <w:szCs w:val="22"/>
     </w:rPr>
   </w:style>
   <w:style w:type="paragraph" w:styleId="Heading4">
@@ -1354,8 +1363,8 @@
       <w:spacing w:after="0" w:line="240" w:lineRule="auto"/>
     </w:pPr>
     <w:rPr>
-      <w:sz w:val="19"/>
-      <w:szCs w:val="19"/>
+      <w:sz w:val="18"/>
+      <w:szCs w:val="18"/>
     </w:rPr>
   </w:style>
   <w:style w:type="character" w:styleId="FootnoteTextChar">
@@ -1366,8 +1375,8 @@
     <w:semiHidden/>
     <w:unhideWhenUsed/>
     <w:rPr>
-      <w:sz w:val="19"/>
-      <w:szCs w:val="19"/>
+      <w:sz w:val="18"/>
+      <w:szCs w:val="18"/>
     </w:rPr>
   </w:style>
 </w:styles>

</xml_diff>

<commit_message>
resumes(site): carry 3 moved measured figure(s) into the shipped copies (unattended refresh)
Runs changed (old -> new):
  '59,000' -> '60,000'
  '28,000' -> '26,000'; '33' -> '30'
  '59,000' -> '60,000'

Oracle: PASS: pipeline reproduces shipped

Tokenization Systems <zach@tokenization.systems>
</commit_message>
<xml_diff>
--- a/resumes/Zukowski_Resume_AI_Governance_Infrastructure.docx
+++ b/resumes/Zukowski_Resume_AI_Governance_Infrastructure.docx
@@ -129,9 +129,9 @@
           <w:i w:val="0"/>
           <w:sz w:val="17"/>
         </w:rPr>
-        <w:t>· Agent fleet: over 59,000 commits · typical overlap 14, peak 61 · commit gate of over 200 checks</w:t>
+        <w:t>· Agent fleet: over 60,000 commits · typical overlap 14, peak 61 · commit gate of over 200 checks</w:t>
         <w:br/>
-        <w:t>· over 28,000 advisory firings measured across 33 classes · 78⁠-⁠skill library · 33⁠-⁠file canonical⁠-⁠state layer</w:t>
+        <w:t>· over 26,000 advisory firings measured across 30 classes · 78⁠-⁠skill library · 33⁠-⁠file canonical⁠-⁠state layer</w:t>
         <w:br/>
         <w:t>· 37 USPTO patent applications across 27 families (Canonical⁠-⁠State Architecture for multi⁠-⁠agent AI research)</w:t>
         <w:br/>
@@ -697,7 +697,7 @@
         <w:t>Canonical-State Architecture.</w:t>
       </w:r>
       <w:r>
-        <w:t xml:space="preserve"> Filed 37 US patent applications across 27 families in 2026. Twelve applications across four families cover coordination and integrity for concurrent AI-agent sessions on a shared version-controlled repository: per-session staging-index isolation, a multi-mode verification engine, a commit-time canonical-state coherence gate, recursive self-validation of discipline codifications, a tamper-evident coordination-proof log, authorship-narrowed commit replay with a per-writer edit-intent ledger, and statement-time provenance binding under fail-closed admission control; validated on over 59,000 commits and 12 to 55 concurrent agents over seven months (as of 2026-09-28), with a companion 73-page methodology preprint. The other twenty-three families cover evidence-grounding interlocks against hallucinated machine assessment (two applications); typed-absence control attribution for pseudonymous on-chain systems (three); instrument-absence as a typed outcome with verifier-integrity controls (two); authority-aware context retrieval, resource-triggered session handoff, fleet launch-governance admission, contribution attestation, and derived-artifact coherence (six); calibration-gated detector promotion and evaluation instrumentation (three); reputation-weighted governance thresholds (two); and seven families filed since August covering provenance-chain attribution, source-fidelity omission-and-fabrication detection, outbound-artifact gating as typed negative outcomes, blinded evaluation batteries, peer-health-gated destructive cleanup, confidence-gated typed-judgment offload, and warranted destructive maintenance anchored to prior repository state (one each).</w:t>
+        <w:t xml:space="preserve"> Filed 37 US patent applications across 27 families in 2026. Twelve applications across four families cover coordination and integrity for concurrent AI-agent sessions on a shared version-controlled repository: per-session staging-index isolation, a multi-mode verification engine, a commit-time canonical-state coherence gate, recursive self-validation of discipline codifications, a tamper-evident coordination-proof log, authorship-narrowed commit replay with a per-writer edit-intent ledger, and statement-time provenance binding under fail-closed admission control; validated on over 60,000 commits and 12 to 55 concurrent agents over seven months (as of 2026-09-28), with a companion 73-page methodology preprint. The other twenty-three families cover evidence-grounding interlocks against hallucinated machine assessment (two applications); typed-absence control attribution for pseudonymous on-chain systems (three); instrument-absence as a typed outcome with verifier-integrity controls (two); authority-aware context retrieval, resource-triggered session handoff, fleet launch-governance admission, contribution attestation, and derived-artifact coherence (six); calibration-gated detector promotion and evaluation instrumentation (three); reputation-weighted governance thresholds (two); and seven families filed since August covering provenance-chain attribution, source-fidelity omission-and-fabrication detection, outbound-artifact gating as typed negative outcomes, blinded evaluation batteries, peer-health-gated destructive cleanup, confidence-gated typed-judgment offload, and warranted destructive maintenance anchored to prior repository state (one each).</w:t>
       </w:r>
     </w:p>
     <w:p>

</xml_diff>

<commit_message>
resumes(site): carry 2 moved measured figure(s) into the shipped copies (unattended refresh)
Runs changed (old -> new):
  '60,000' -> '61,000'
  '60,000' -> '61,000'

Oracle: PASS: pipeline reproduces shipped

Tokenization Systems <zach@tokenization.systems>
</commit_message>
<xml_diff>
--- a/resumes/Zukowski_Resume_AI_Governance_Infrastructure.docx
+++ b/resumes/Zukowski_Resume_AI_Governance_Infrastructure.docx
@@ -129,7 +129,7 @@
           <w:i w:val="0"/>
           <w:sz w:val="17"/>
         </w:rPr>
-        <w:t>· Agent fleet: over 60,000 commits · typical overlap 14, peak 61 · commit gate of over 200 checks</w:t>
+        <w:t>· Agent fleet: over 61,000 commits · typical overlap 14, peak 61 · commit gate of over 200 checks</w:t>
         <w:br/>
         <w:t>· over 27,000 advisory firings measured across 30 classes · 78⁠-⁠skill library · 33⁠-⁠file canonical⁠-⁠state layer</w:t>
         <w:br/>
@@ -697,7 +697,7 @@
         <w:t>Canonical-State Architecture.</w:t>
       </w:r>
       <w:r>
-        <w:t xml:space="preserve"> Filed 37 US patent applications across 27 families in 2026. Twelve applications across four families cover coordination and integrity for concurrent AI-agent sessions on a shared version-controlled repository: per-session staging-index isolation, a multi-mode verification engine, a commit-time canonical-state coherence gate, recursive self-validation of discipline codifications, a tamper-evident coordination-proof log, authorship-narrowed commit replay with a per-writer edit-intent ledger, and statement-time provenance binding under fail-closed admission control; validated on over 60,000 commits and 12 to 55 concurrent agents over seven months (as of 2026-09-28), with a companion 73-page methodology preprint. The other twenty-three families cover evidence-grounding interlocks against hallucinated machine assessment (two applications); typed-absence control attribution for pseudonymous on-chain systems (three); instrument-absence as a typed outcome with verifier-integrity controls (two); authority-aware context retrieval, resource-triggered session handoff, fleet launch-governance admission, contribution attestation, and derived-artifact coherence (six); calibration-gated detector promotion and evaluation instrumentation (three); reputation-weighted governance thresholds (two); and seven families filed since August covering provenance-chain attribution, source-fidelity omission-and-fabrication detection, outbound-artifact gating as typed negative outcomes, blinded evaluation batteries, peer-health-gated destructive cleanup, confidence-gated typed-judgment offload, and warranted destructive maintenance anchored to prior repository state (one each).</w:t>
+        <w:t xml:space="preserve"> Filed 37 US patent applications across 27 families in 2026. Twelve applications across four families cover coordination and integrity for concurrent AI-agent sessions on a shared version-controlled repository: per-session staging-index isolation, a multi-mode verification engine, a commit-time canonical-state coherence gate, recursive self-validation of discipline codifications, a tamper-evident coordination-proof log, authorship-narrowed commit replay with a per-writer edit-intent ledger, and statement-time provenance binding under fail-closed admission control; validated on over 61,000 commits and 12 to 55 concurrent agents over seven months (as of 2026-09-28), with a companion 73-page methodology preprint. The other twenty-three families cover evidence-grounding interlocks against hallucinated machine assessment (two applications); typed-absence control attribution for pseudonymous on-chain systems (three); instrument-absence as a typed outcome with verifier-integrity controls (two); authority-aware context retrieval, resource-triggered session handoff, fleet launch-governance admission, contribution attestation, and derived-artifact coherence (six); calibration-gated detector promotion and evaluation instrumentation (three); reputation-weighted governance thresholds (two); and seven families filed since August covering provenance-chain attribution, source-fidelity omission-and-fabrication detection, outbound-artifact gating as typed negative outcomes, blinded evaluation batteries, peer-health-gated destructive cleanup, confidence-gated typed-judgment offload, and warranted destructive maintenance anchored to prior repository state (one each).</w:t>
       </w:r>
     </w:p>
     <w:p>

</xml_diff>

<commit_message>
resumes(site): carry 13 moved measured figure(s) into the shipped copies (unattended refresh)
Runs changed (old -> new):
  '27,000' -> '56,000'; '30' -> '35'
  '21' -> '22'
  '21' -> '22'
  '21' -> '22'
  '21' -> '22'
  '21' -> '22'
  '21' -> '22'
  '21' -> '22'
  '21' -> '22'
  '21' -> '22'
  '21' -> '22'
  '21' -> '22'
  '21' -> '22'

Oracle: PASS: pipeline reproduces shipped

Tokenization Systems <zach@tokenization.systems>
</commit_message>
<xml_diff>
--- a/resumes/Zukowski_Resume_AI_Governance_Infrastructure.docx
+++ b/resumes/Zukowski_Resume_AI_Governance_Infrastructure.docx
@@ -131,11 +131,11 @@
         </w:rPr>
         <w:t>· Agent fleet: over 61,000 commits · typical overlap 14, peak 61 · commit gate of over 200 checks</w:t>
         <w:br/>
-        <w:t>· over 27,000 advisory firings measured across 30 classes · 78⁠-⁠skill library · 33⁠-⁠file canonical⁠-⁠state layer</w:t>
+        <w:t>· over 56,000 advisory firings measured across 35 classes · 78⁠-⁠skill library · 33⁠-⁠file canonical⁠-⁠state layer</w:t>
         <w:br/>
         <w:t>· 37 USPTO patent applications across 27 families (Canonical⁠-⁠State Architecture for multi⁠-⁠agent AI research)</w:t>
         <w:br/>
-        <w:t>· 9 SSRN papers · 21 federal comment letters · FSB AI consultation response</w:t>
+        <w:t>· 9 SSRN papers · 22 federal comment letters · FSB AI consultation response</w:t>
       </w:r>
     </w:p>
     <w:p>
@@ -310,7 +310,7 @@
         <w:ind w:left="320" w:hanging="160"/>
       </w:pPr>
       <w:r>
-        <w:t xml:space="preserve">• Contributed 21 comment letters across a federal regulatory program (OCC bank stablecoin engagement </w:t>
+        <w:t xml:space="preserve">• Contributed 22 comment letters across a federal regulatory program (OCC bank stablecoin engagement </w:t>
       </w:r>
       <w:hyperlink r:id="rId13">
         <w:r>

</xml_diff>

<commit_message>
resumes(site): carry 12 moved measured figure(s) into the shipped copies (unattended refresh)
Runs changed (old -> new):
  '22' -> '21'
  '22' -> '21'
  '22' -> '21'
  '22' -> '21'
  '22' -> '21'
  '22' -> '21'
  '22' -> '21'
  '22' -> '21'
  '22' -> '21'
  '22' -> '21'
  '22' -> '21'
  '22' -> '21'

Oracle: PASS: pipeline reproduces shipped

Tokenization Systems <zach@tokenization.systems>
</commit_message>
<xml_diff>
--- a/resumes/Zukowski_Resume_AI_Governance_Infrastructure.docx
+++ b/resumes/Zukowski_Resume_AI_Governance_Infrastructure.docx
@@ -135,7 +135,7 @@
         <w:br/>
         <w:t>· 37 USPTO patent applications across 27 families (Canonical⁠-⁠State Architecture for multi⁠-⁠agent AI research)</w:t>
         <w:br/>
-        <w:t>· 9 SSRN papers · 22 federal comment letters · FSB AI consultation response</w:t>
+        <w:t>· 9 SSRN papers · 21 federal comment letters · FSB AI consultation response</w:t>
       </w:r>
     </w:p>
     <w:p>
@@ -310,7 +310,7 @@
         <w:ind w:left="320" w:hanging="160"/>
       </w:pPr>
       <w:r>
-        <w:t xml:space="preserve">• Contributed 22 comment letters across a federal regulatory program (OCC bank stablecoin engagement </w:t>
+        <w:t xml:space="preserve">• Contributed 21 comment letters across a federal regulatory program (OCC bank stablecoin engagement </w:t>
       </w:r>
       <w:hyperlink r:id="rId13">
         <w:r>

</xml_diff>

<commit_message>
Sync 42nd USPTO patent (64/180,865), add B2 and A4 interactive explorers, and clarify site copy
- Add USPTO provisional application 64/180,865 (claim, lease, and park resolution) to /patents/ Area 4 and sync 42 applications across 32 families and 67,000+ commits across all HTML surfaces, JSON datasets, and shipped DOCX/PDF resumes
- Add interactive 52-protocol PCA exclusion and 18-protocol delegation amplification explorer (#b2-gov-explorer) to /papers/governance-concentration/
- Add interactive 10-entity shared-dependency outage simulator and corporate-actions reconciliation explorer (#a4-strategy-explorer) to /papers/three-strategies/
- Sync /agent-infrastructure/ hero proof strip (199 in 200 and data-scale-hard-gate attributes) and guard in check_agent_infra_stats.py
- Clarify double/triple negatives and stand-alone patent filing titles on /, /agent-infrastructure/, and /patents/

Cursor Argon 4 High <zach@tokenization.systems>
</commit_message>
<xml_diff>
--- a/resumes/Zukowski_Resume_AI_Governance_Infrastructure.docx
+++ b/resumes/Zukowski_Resume_AI_Governance_Infrastructure.docx
@@ -129,11 +129,11 @@
           <w:i w:val="0"/>
           <w:sz w:val="17"/>
         </w:rPr>
-        <w:t>· Agent fleet: over 66,000 commits · typical overlap 14, peak 61 · commit gate of over 200 checks</w:t>
+        <w:t>· Agent fleet: over 67,000 commits · typical overlap 14, peak 61 · commit gate of over 200 checks</w:t>
         <w:br/>
         <w:t>· over 61,000 advisory firings measured across 37 classes · 78⁠-⁠skill library · 33⁠-⁠file canonical⁠-⁠state layer</w:t>
         <w:br/>
-        <w:t>· 41 USPTO patent applications across 31 families (Canonical⁠-⁠State Architecture for multi⁠-⁠agent AI research)</w:t>
+        <w:t>· 42 USPTO patent applications across 32 families (Canonical⁠-⁠State Architecture for multi⁠-⁠agent AI research)</w:t>
         <w:br/>
         <w:t>· 9 SSRN papers · 25 federal comment letters · FSB AI consultation response</w:t>
       </w:r>
@@ -697,7 +697,7 @@
         <w:t>Canonical-State Architecture.</w:t>
       </w:r>
       <w:r>
-        <w:t xml:space="preserve"> Filed 41 US patent applications across 31 families in 2026. Twelve applications across four families cover coordination and integrity for concurrent AI-agent sessions on a shared version-controlled repository: per-session staging-index isolation, a multi-mode verification engine, a commit-time canonical-state coherence gate, recursive self-validation of discipline codifications, a tamper-evident coordination-proof log, authorship-narrowed commit replay with a per-writer edit-intent ledger, and statement-time provenance binding under fail-closed admission control; validated on over 66,000 commits and 12 to 55 concurrent agents over seven months (as of 2026-09-28), with a companion 73-page methodology preprint. The other twenty-seven families cover evidence-grounding interlocks against hallucinated machine assessment (two applications); typed-absence control attribution for pseudonymous on-chain systems (three); instrument-absence as a typed outcome with verifier-integrity controls (two); authority-aware context retrieval, resource-triggered session handoff, fleet launch-governance admission, contribution attestation, and derived-artifact coherence (six); calibration-gated detector promotion and evaluation instrumentation (three); reputation-weighted governance thresholds (two); and eleven families filed since August covering provenance-chain attribution, source-fidelity omission-and-fabrication detection, outbound-artifact gating as typed negative outcomes, blinded evaluation batteries, peer-health-gated destructive cleanup, confidence-gated typed-judgment offload, warranted destructive maintenance anchored to prior repository state, its receipt-gated key recovery, observer-first control arming, an operator-controlled agent perimeter, and governed agent authority (one each).</w:t>
+        <w:t xml:space="preserve"> Filed 41 US patent applications across 32 families in 2026. Twelve applications across four families cover coordination and integrity for concurrent AI-agent sessions on a shared version-controlled repository: per-session staging-index isolation, a multi-mode verification engine, a commit-time canonical-state coherence gate, recursive self-validation of discipline codifications, a tamper-evident coordination-proof log, authorship-narrowed commit replay with a per-writer edit-intent ledger, and statement-time provenance binding under fail-closed admission control; validated on over 67,000 commits and 12 to 55 concurrent agents over seven months (as of 2026-09-28), with a companion 73-page methodology preprint. The other twenty-eight families cover evidence-grounding interlocks against hallucinated machine assessment (two applications); typed-absence control attribution for pseudonymous on-chain systems (three); instrument-absence as a typed outcome with verifier-integrity controls (two); authority-aware context retrieval, resource-triggered session handoff, fleet launch-governance admission, contribution attestation, and derived-artifact coherence (six); calibration-gated detector promotion and evaluation instrumentation (three); reputation-weighted governance thresholds (two); and eleven families filed since August covering provenance-chain attribution, source-fidelity omission-and-fabrication detection, outbound-artifact gating as typed negative outcomes, blinded evaluation batteries, peer-health-gated destructive cleanup, confidence-gated typed-judgment offload, warranted destructive maintenance anchored to prior repository state, its receipt-gated key recovery, observer-first control arming, an operator-controlled agent perimeter, and governed agent authority (one each).</w:t>
       </w:r>
     </w:p>
     <w:p>

</xml_diff>

<commit_message>
feat(site): refresh 79-bin commit chart through Oct 24 (68,000+ commits, 63,230 advisories) and fix /letters/ table padding
- Refresh interactive fleet commit chart through 24 October 2026 (79 three-day bins, 67,675 commits in series, 68,264 on ref, 2,317 in Oct 22-24 bin) and sync 68,000+ commits and 63,230 advisory outcomes (107 days) across all HTML pages, JSON/SVG/PNG assets, and shipped DOCX/PDF resumes
- Fix render_commit_chart.py write ordering so draft_site_figures_revision.py runs before stamping agent-infrastructure/index.html, and compare live workflow repo bins against on-disk JSON in update_site_metrics.py
- Remove the 2px first-column padding override on .letters-timeline in styles.css so 'OCC: GENIUS Act implementation...' and all first-column cells on /letters/ and /letters/recommendations/ have proper 14px left clearance from the table border

Cursor + Argon High
</commit_message>
<xml_diff>
--- a/resumes/Zukowski_Resume_AI_Governance_Infrastructure.docx
+++ b/resumes/Zukowski_Resume_AI_Governance_Infrastructure.docx
@@ -129,9 +129,9 @@
           <w:i w:val="0"/>
           <w:sz w:val="17"/>
         </w:rPr>
-        <w:t>· Agent fleet: over 67,000 commits · typical overlap 14, peak 61 · commit gate of over 200 checks</w:t>
+        <w:t>· Agent fleet: over 68,000 commits · typical overlap 14, peak 61 · commit gate of over 200 checks</w:t>
         <w:br/>
-        <w:t>· over 61,000 advisory firings measured across 37 classes · 78⁠-⁠skill library · 33⁠-⁠file canonical⁠-⁠state layer</w:t>
+        <w:t>· over 63,000 advisory firings measured across 37 classes · 78⁠-⁠skill library · 33⁠-⁠file canonical⁠-⁠state layer</w:t>
         <w:br/>
         <w:t>· 42 USPTO patent applications across 32 families (Canonical⁠-⁠State Architecture for multi⁠-⁠agent AI research)</w:t>
         <w:br/>
@@ -697,7 +697,7 @@
         <w:t>Canonical-State Architecture.</w:t>
       </w:r>
       <w:r>
-        <w:t xml:space="preserve"> Filed 41 US patent applications across 32 families in 2026. Twelve applications across four families cover coordination and integrity for concurrent AI-agent sessions on a shared version-controlled repository: per-session staging-index isolation, a multi-mode verification engine, a commit-time canonical-state coherence gate, recursive self-validation of discipline codifications, a tamper-evident coordination-proof log, authorship-narrowed commit replay with a per-writer edit-intent ledger, and statement-time provenance binding under fail-closed admission control; validated on over 67,000 commits and 12 to 55 concurrent agents over seven months (as of 2026-09-28), with a companion 73-page methodology preprint. The other twenty-eight families cover evidence-grounding interlocks against hallucinated machine assessment (two applications); typed-absence control attribution for pseudonymous on-chain systems (three); instrument-absence as a typed outcome with verifier-integrity controls (two); authority-aware context retrieval, resource-triggered session handoff, fleet launch-governance admission, contribution attestation, and derived-artifact coherence (six); calibration-gated detector promotion and evaluation instrumentation (three); reputation-weighted governance thresholds (two); and eleven families filed since August covering provenance-chain attribution, source-fidelity omission-and-fabrication detection, outbound-artifact gating as typed negative outcomes, blinded evaluation batteries, peer-health-gated destructive cleanup, confidence-gated typed-judgment offload, warranted destructive maintenance anchored to prior repository state, its receipt-gated key recovery, observer-first control arming, an operator-controlled agent perimeter, and governed agent authority (one each).</w:t>
+        <w:t xml:space="preserve"> Filed 41 US patent applications across 32 families in 2026. Twelve applications across four families cover coordination and integrity for concurrent AI-agent sessions on a shared version-controlled repository: per-session staging-index isolation, a multi-mode verification engine, a commit-time canonical-state coherence gate, recursive self-validation of discipline codifications, a tamper-evident coordination-proof log, authorship-narrowed commit replay with a per-writer edit-intent ledger, and statement-time provenance binding under fail-closed admission control; validated on over 68,000 commits and 12 to 55 concurrent agents over seven months (as of 2026-09-28), with a companion 73-page methodology preprint. The other twenty-eight families cover evidence-grounding interlocks against hallucinated machine assessment (two applications); typed-absence control attribution for pseudonymous on-chain systems (three); instrument-absence as a typed outcome with verifier-integrity controls (two); authority-aware context retrieval, resource-triggered session handoff, fleet launch-governance admission, contribution attestation, and derived-artifact coherence (six); calibration-gated detector promotion and evaluation instrumentation (three); reputation-weighted governance thresholds (two); and eleven families filed since August covering provenance-chain attribution, source-fidelity omission-and-fabrication detection, outbound-artifact gating as typed negative outcomes, blinded evaluation batteries, peer-health-gated destructive cleanup, confidence-gated typed-judgment offload, warranted destructive maintenance anchored to prior repository state, its receipt-gated key recovery, observer-first control arming, an operator-controlled agent perimeter, and governed agent authority (one each).</w:t>
       </w:r>
     </w:p>
     <w:p>

</xml_diff>

<commit_message>
feat(patents): 46 filed USPTO applications across 36 families; add the four applications filed 2026-10-25
/patents/ lists 64/183,968 (output-context faithfulness verification of machine-generated text), 64/183,971
(agent-scale landing on a shared repository), 64/183,981 (integrity, containment, landing, identity and continuity
controls for agent fleets) and 64/183,991 (contribution accounting, commit-time gating, serialized landing, worktree
lifecycle and session-start state controls), and the count is carried to every page that states it, patents.json,
llms.txt, the sitemap, the resume pages and the six resume DOCX and PDF files (each still 2 pages).

Tokenization Systems - Opus 5.5 <zach@tokenization.systems>
</commit_message>
<xml_diff>
--- a/resumes/Zukowski_Resume_AI_Governance_Infrastructure.docx
+++ b/resumes/Zukowski_Resume_AI_Governance_Infrastructure.docx
@@ -133,7 +133,7 @@
         <w:br/>
         <w:t>· over 63,000 advisory firings measured across 37 classes · 78⁠-⁠skill library · 33⁠-⁠file canonical⁠-⁠state layer</w:t>
         <w:br/>
-        <w:t>· 42 USPTO patent applications across 32 families (Canonical⁠-⁠State Architecture for multi⁠-⁠agent AI research)</w:t>
+        <w:t>· 46 USPTO patent applications across 36 families (Canonical⁠-⁠State Architecture for multi⁠-⁠agent AI research)</w:t>
         <w:br/>
         <w:t>· 9 SSRN papers · 25 federal comment letters · FSB AI consultation response</w:t>
       </w:r>
@@ -697,7 +697,7 @@
         <w:t>Canonical-State Architecture.</w:t>
       </w:r>
       <w:r>
-        <w:t xml:space="preserve"> Filed 41 US patent applications across 32 families in 2026. Twelve applications across four families cover coordination and integrity for concurrent AI-agent sessions on a shared version-controlled repository: per-session staging-index isolation, a multi-mode verification engine, a commit-time canonical-state coherence gate, recursive self-validation of discipline codifications, a tamper-evident coordination-proof log, authorship-narrowed commit replay with a per-writer edit-intent ledger, and statement-time provenance binding under fail-closed admission control; validated on over 68,000 commits and 12 to 55 concurrent agents over seven months (as of 2026-09-28), with a companion 73-page methodology preprint. The other twenty-eight families cover evidence-grounding interlocks against hallucinated machine assessment (two applications); typed-absence control attribution for pseudonymous on-chain systems (three); instrument-absence as a typed outcome with verifier-integrity controls (two); authority-aware context retrieval, resource-triggered session handoff, fleet launch-governance admission, contribution attestation, and derived-artifact coherence (six); calibration-gated detector promotion and evaluation instrumentation (three); reputation-weighted governance thresholds (two); and eleven families filed since August covering provenance-chain attribution, source-fidelity omission-and-fabrication detection, outbound-artifact gating as typed negative outcomes, blinded evaluation batteries, peer-health-gated destructive cleanup, confidence-gated typed-judgment offload, warranted destructive maintenance anchored to prior repository state, its receipt-gated key recovery, observer-first control arming, an operator-controlled agent perimeter, and governed agent authority (one each).</w:t>
+        <w:t xml:space="preserve"> Filed 41 US patent applications across 36 families in 2026. Twelve applications across four families cover coordination and integrity for concurrent AI-agent sessions on a shared version-controlled repository: per-session staging-index isolation, a multi-mode verification engine, a commit-time canonical-state coherence gate, recursive self-validation of discipline codifications, a tamper-evident coordination-proof log, authorship-narrowed commit replay with a per-writer edit-intent ledger, and statement-time provenance binding under fail-closed admission control; validated on over 68,000 commits and 12 to 55 concurrent agents over seven months (as of 2026-09-28), with a companion 73-page methodology preprint. The other thirty-two families cover evidence-grounding interlocks against hallucinated machine assessment (two applications); typed-absence control attribution for pseudonymous on-chain systems (three); instrument-absence as a typed outcome with verifier-integrity controls (two); authority-aware context retrieval, resource-triggered session handoff, fleet launch-governance admission, contribution attestation, and derived-artifact coherence (six); calibration-gated detector promotion and evaluation instrumentation (three); reputation-weighted governance thresholds (two); and eleven families filed since August covering provenance-chain attribution, source-fidelity omission-and-fabrication detection, outbound-artifact gating as typed negative outcomes, blinded evaluation batteries, peer-health-gated destructive cleanup, confidence-gated typed-judgment offload, warranted destructive maintenance anchored to prior repository state, its receipt-gated key recovery, observer-first control arming, an operator-controlled agent perimeter, and governed agent authority (one each).</w:t>
       </w:r>
     </w:p>
     <w:p>

</xml_diff>